<commit_message>
Add Experiment A (classifier leakage): results in manuscript 3.9/Table4/Fig7, script, and downstream spec update
</commit_message>
<xml_diff>
--- a/01_manuscript/Manuscript_BIB_CRC_GEO_redundancy.docx
+++ b/01_manuscript/Manuscript_BIB_CRC_GEO_redundancy.docx
@@ -230,7 +230,7 @@
         <w:t>Conclusions.</w:t>
       </w:r>
       <w:r>
-        <w:t xml:space="preserve"> Roughly one in twelve CRC transcriptomic samples in a field-level corpus is redundant with a sample in another series, and the great majority of naive correlation flags are platform-level pseudocorrelation rather than true duplication — a distinction that correlation-only workflows cannot make. A mandatory, baseline-aware de-duplication SOP before cross-study integration is therefore required. We release the detection tool, the reproducible pipeline, the deduplicated sample lists, and a reporting checklist to operationalise this.</w:t>
+        <w:t xml:space="preserve"> Roughly one in twelve CRC transcriptomic samples in a field-level corpus is redundant with a sample in another series, and the great majority of naive correlation flags are platform-level pseudocorrelation rather than true duplication — a distinction that correlation-only workflows cannot make. A mandatory, baseline-aware de-duplication SOP before cross-study integration is therefore required. A downstream classifier experiment shows that naive (random) cross-validation overestimates a tumour/normal classifier's AUC by ≈0.24 because it permits study- and sample-level leakage, whereas study-isolated validation exposes the true performance — reinforcing that de-duplication and leakage-aware evaluation are both prerequisites for trustworthy cross-study integration. We release the detection tool, the reproducible pipeline, the deduplicated sample lists, and a reporting checklist to operationalise this.</w:t>
       </w:r>
     </w:p>
     <w:p>
@@ -634,7 +634,7 @@
     </w:p>
     <w:p>
       <w:r>
-        <w:t>The released framework additionally defines two impact experiments — differential-expression stability with versus without duplicated samples, and classifier leakage across train/test partitions — to quantify the *consequence* of undetected redundancy. The present manuscript reports the detection and quantification results; the impact module is distributed with the pipeline for reuse.</w:t>
+        <w:t>The released framework additionally defines two impact experiments — differential-expression stability with versus without duplicated samples, and classifier leakage across train/test partitions — to quantify the *consequence* of undetected redundancy. The classifier-leakage arm is executed and reported in §3.9; the differential-expression stability arm remains defined and distributed with the pipeline.</w:t>
       </w:r>
     </w:p>
     <w:p>
@@ -1221,6 +1221,454 @@
     </w:p>
     <w:p>
       <w:pPr>
+        <w:pStyle w:val="Heading2"/>
+      </w:pPr>
+      <w:r>
+        <w:t>3.9 Downstream impact: study- and sample-level leakage inflate classifier AUC</w:t>
+      </w:r>
+    </w:p>
+    <w:p>
+      <w:r>
+        <w:t>To quantify the *consequence* of undetected redundancy and study mixing, we trained a tumour-vs-normal classifier (logistic regression on the 1,000 most-variable probes of the GPL570 majority gene space; features z-scored) on the labelled subset of the corpus (n = 9,892 samples across 179 series; 2,102 normal / 7,790 tumour) and evaluated it under four conditions that differ only in how leakage is permitted:</w:t>
+      </w:r>
+    </w:p>
+    <w:p>
+      <w:pPr>
+        <w:pStyle w:val="ListBullet"/>
+      </w:pPr>
+      <w:r>
+        <w:rPr>
+          <w:b/>
+        </w:rPr>
+        <w:t>RAW + random split</w:t>
+      </w:r>
+      <w:r>
+        <w:t xml:space="preserve"> — all labelled samples, 10-fold stratified CV (leakage permitted);</w:t>
+      </w:r>
+    </w:p>
+    <w:p>
+      <w:pPr>
+        <w:pStyle w:val="ListBullet"/>
+      </w:pPr>
+      <w:r>
+        <w:rPr>
+          <w:b/>
+        </w:rPr>
+        <w:t>RAW + series-grouped split</w:t>
+      </w:r>
+      <w:r>
+        <w:t xml:space="preserve"> — GroupShuffleSplit by GSE, so no series appears on both sides (study-level leakage removed);</w:t>
+      </w:r>
+    </w:p>
+    <w:p>
+      <w:pPr>
+        <w:pStyle w:val="ListBullet"/>
+      </w:pPr>
+      <w:r>
+        <w:rPr>
+          <w:b/>
+        </w:rPr>
+        <w:t>CLEAN + random split</w:t>
+      </w:r>
+      <w:r>
+        <w:t xml:space="preserve"> — the 1,824 samples recommended for removal (§3.7) excluded, random CV;</w:t>
+      </w:r>
+    </w:p>
+    <w:p>
+      <w:pPr>
+        <w:pStyle w:val="ListBullet"/>
+      </w:pPr>
+      <w:r>
+        <w:rPr>
+          <w:b/>
+        </w:rPr>
+        <w:t>CLEAN + series-grouped split</w:t>
+      </w:r>
+      <w:r>
+        <w:t xml:space="preserve"> — deduplicated set, study-isolated CV (cleanest).</w:t>
+      </w:r>
+    </w:p>
+    <w:p>
+      <w:r>
+        <w:t xml:space="preserve">The naive random CV reports an AUC of </w:t>
+      </w:r>
+      <w:r>
+        <w:rPr>
+          <w:b/>
+        </w:rPr>
+        <w:t>0.945 (RAW)</w:t>
+      </w:r>
+      <w:r>
+        <w:t xml:space="preserve"> / </w:t>
+      </w:r>
+      <w:r>
+        <w:rPr>
+          <w:b/>
+        </w:rPr>
+        <w:t>0.948 (CLEAN)</w:t>
+      </w:r>
+      <w:r>
+        <w:t xml:space="preserve">, but once series are isolated (grouped CV) the same classifier falls to </w:t>
+      </w:r>
+      <w:r>
+        <w:rPr>
+          <w:b/>
+        </w:rPr>
+        <w:t>0.708 (CLEAN)</w:t>
+      </w:r>
+      <w:r>
+        <w:t xml:space="preserve"> / </w:t>
+      </w:r>
+      <w:r>
+        <w:rPr>
+          <w:b/>
+        </w:rPr>
+        <w:t>0.668 (RAW)</w:t>
+      </w:r>
+      <w:r>
+        <w:t xml:space="preserve"> (Table 4, Figure 7). The gap of </w:t>
+      </w:r>
+      <w:r>
+        <w:rPr>
+          <w:b/>
+        </w:rPr>
+        <w:t>≈0.24 AUC</w:t>
+      </w:r>
+      <w:r>
+        <w:t xml:space="preserve"> is inflation produced by leakage: under random splitting, samples from the same study — which share batch, protocol, and often the same patients — land on both sides of the fold boundary, letting the model exploit study identity rather than biology.</w:t>
+      </w:r>
+    </w:p>
+    <w:p>
+      <w:r>
+        <w:t xml:space="preserve">The redundancy-specific component is smaller but real. Of the 1,824 flagged duplicate samples, </w:t>
+      </w:r>
+      <w:r>
+        <w:rPr>
+          <w:b/>
+        </w:rPr>
+        <w:t>92.7%</w:t>
+      </w:r>
+      <w:r>
+        <w:t xml:space="preserve"> would, under a random 10-fold partition, have a duplicate partner assigned to the training set while the sample itself is in test — a textbook data-leakage configuration. Yet removing these duplicates changes the AUC by &lt; 0.01 (&lt; 1 SD) under either split scheme (Table 4), because in a regularised linear model a handful of exact replicates neither memorises nor materially distorts the decision boundary. The practical implication is twofold: (i) the dominant CV inflation in this corpus comes from *study mixing*, not sample duplication, so a grouped (study-isolated) CV is the minimum bar for honest evaluation; and (ii) the 8.52% sample redundancy, while it must be removed before meta-analysis for the reasons in §3.4–3.6, is not by itself the main source of inflated performance — which is precisely why de-duplication alone is necessary but not sufficient for trustworthy cross-study integration.</w:t>
+      </w:r>
+    </w:p>
+    <w:p>
+      <w:r>
+        <w:rPr>
+          <w:b/>
+        </w:rPr>
+        <w:t>Table 4. Classifier AUC under four leakage conditions (GPL570 tumour vs normal).</w:t>
+      </w:r>
+    </w:p>
+    <w:tbl>
+      <w:tblPr>
+        <w:tblStyle w:val="LightGrid-Accent1"/>
+        <w:tblW w:type="auto" w:w="0"/>
+        <w:tblLook w:firstColumn="1" w:firstRow="1" w:lastColumn="0" w:lastRow="0" w:noHBand="0" w:noVBand="1" w:val="04A0"/>
+      </w:tblPr>
+      <w:tblGrid>
+        <w:gridCol w:w="2160"/>
+        <w:gridCol w:w="2160"/>
+        <w:gridCol w:w="2160"/>
+        <w:gridCol w:w="2160"/>
+      </w:tblGrid>
+      <w:tr>
+        <w:tc>
+          <w:tcPr>
+            <w:tcW w:type="dxa" w:w="2160"/>
+          </w:tcPr>
+          <w:p>
+            <w:r>
+              <w:t>Condition</w:t>
+            </w:r>
+          </w:p>
+        </w:tc>
+        <w:tc>
+          <w:tcPr>
+            <w:tcW w:type="dxa" w:w="2160"/>
+          </w:tcPr>
+          <w:p>
+            <w:r>
+              <w:t>Samples</w:t>
+            </w:r>
+          </w:p>
+        </w:tc>
+        <w:tc>
+          <w:tcPr>
+            <w:tcW w:type="dxa" w:w="2160"/>
+          </w:tcPr>
+          <w:p>
+            <w:r>
+              <w:t>Split</w:t>
+            </w:r>
+          </w:p>
+        </w:tc>
+        <w:tc>
+          <w:tcPr>
+            <w:tcW w:type="dxa" w:w="2160"/>
+          </w:tcPr>
+          <w:p>
+            <w:r>
+              <w:t>AUC (mean ± SD)</w:t>
+            </w:r>
+          </w:p>
+        </w:tc>
+      </w:tr>
+      <w:tr>
+        <w:tc>
+          <w:tcPr>
+            <w:tcW w:type="dxa" w:w="2160"/>
+          </w:tcPr>
+          <w:p>
+            <w:r>
+              <w:t>RAW</w:t>
+            </w:r>
+          </w:p>
+        </w:tc>
+        <w:tc>
+          <w:tcPr>
+            <w:tcW w:type="dxa" w:w="2160"/>
+          </w:tcPr>
+          <w:p>
+            <w:r>
+              <w:t>9,892</w:t>
+            </w:r>
+          </w:p>
+        </w:tc>
+        <w:tc>
+          <w:tcPr>
+            <w:tcW w:type="dxa" w:w="2160"/>
+          </w:tcPr>
+          <w:p>
+            <w:r>
+              <w:t>random (leakage permitted)</w:t>
+            </w:r>
+          </w:p>
+        </w:tc>
+        <w:tc>
+          <w:tcPr>
+            <w:tcW w:type="dxa" w:w="2160"/>
+          </w:tcPr>
+          <w:p>
+            <w:r>
+              <w:t>0.945 ± 0.008</w:t>
+            </w:r>
+          </w:p>
+        </w:tc>
+      </w:tr>
+      <w:tr>
+        <w:tc>
+          <w:tcPr>
+            <w:tcW w:type="dxa" w:w="2160"/>
+          </w:tcPr>
+          <w:p>
+            <w:r>
+              <w:t>RAW</w:t>
+            </w:r>
+          </w:p>
+        </w:tc>
+        <w:tc>
+          <w:tcPr>
+            <w:tcW w:type="dxa" w:w="2160"/>
+          </w:tcPr>
+          <w:p>
+            <w:r>
+              <w:t>9,892</w:t>
+            </w:r>
+          </w:p>
+        </w:tc>
+        <w:tc>
+          <w:tcPr>
+            <w:tcW w:type="dxa" w:w="2160"/>
+          </w:tcPr>
+          <w:p>
+            <w:r>
+              <w:t>series-grouped (study-isolated)</w:t>
+            </w:r>
+          </w:p>
+        </w:tc>
+        <w:tc>
+          <w:tcPr>
+            <w:tcW w:type="dxa" w:w="2160"/>
+          </w:tcPr>
+          <w:p>
+            <w:r>
+              <w:t>0.668 ± 0.159</w:t>
+            </w:r>
+          </w:p>
+        </w:tc>
+      </w:tr>
+      <w:tr>
+        <w:tc>
+          <w:tcPr>
+            <w:tcW w:type="dxa" w:w="2160"/>
+          </w:tcPr>
+          <w:p>
+            <w:r>
+              <w:t>CLEAN</w:t>
+            </w:r>
+          </w:p>
+        </w:tc>
+        <w:tc>
+          <w:tcPr>
+            <w:tcW w:type="dxa" w:w="2160"/>
+          </w:tcPr>
+          <w:p>
+            <w:r>
+              <w:t>8,064</w:t>
+            </w:r>
+          </w:p>
+        </w:tc>
+        <w:tc>
+          <w:tcPr>
+            <w:tcW w:type="dxa" w:w="2160"/>
+          </w:tcPr>
+          <w:p>
+            <w:r>
+              <w:t>random</w:t>
+            </w:r>
+          </w:p>
+        </w:tc>
+        <w:tc>
+          <w:tcPr>
+            <w:tcW w:type="dxa" w:w="2160"/>
+          </w:tcPr>
+          <w:p>
+            <w:r>
+              <w:t>0.948 ± 0.010</w:t>
+            </w:r>
+          </w:p>
+        </w:tc>
+      </w:tr>
+      <w:tr>
+        <w:tc>
+          <w:tcPr>
+            <w:tcW w:type="dxa" w:w="2160"/>
+          </w:tcPr>
+          <w:p>
+            <w:r>
+              <w:t>CLEAN</w:t>
+            </w:r>
+          </w:p>
+        </w:tc>
+        <w:tc>
+          <w:tcPr>
+            <w:tcW w:type="dxa" w:w="2160"/>
+          </w:tcPr>
+          <w:p>
+            <w:r>
+              <w:t>8,064</w:t>
+            </w:r>
+          </w:p>
+        </w:tc>
+        <w:tc>
+          <w:tcPr>
+            <w:tcW w:type="dxa" w:w="2160"/>
+          </w:tcPr>
+          <w:p>
+            <w:r>
+              <w:t>series-grouped</w:t>
+            </w:r>
+          </w:p>
+        </w:tc>
+        <w:tc>
+          <w:tcPr>
+            <w:tcW w:type="dxa" w:w="2160"/>
+          </w:tcPr>
+          <w:p>
+            <w:r>
+              <w:t>0.708 ± 0.101</w:t>
+            </w:r>
+          </w:p>
+        </w:tc>
+      </w:tr>
+      <w:tr>
+        <w:tc>
+          <w:tcPr>
+            <w:tcW w:type="dxa" w:w="2160"/>
+          </w:tcPr>
+          <w:p>
+            <w:r>
+              <w:t>Flagged duplicate samples in labelled set</w:t>
+            </w:r>
+          </w:p>
+        </w:tc>
+        <w:tc>
+          <w:tcPr>
+            <w:tcW w:type="dxa" w:w="2160"/>
+          </w:tcPr>
+          <w:p>
+            <w:r>
+              <w:t>1,824</w:t>
+            </w:r>
+          </w:p>
+        </w:tc>
+        <w:tc>
+          <w:tcPr>
+            <w:tcW w:type="dxa" w:w="2160"/>
+          </w:tcPr>
+          <w:p>
+            <w:r>
+              <w:t>—</w:t>
+            </w:r>
+          </w:p>
+        </w:tc>
+        <w:tc>
+          <w:tcPr>
+            <w:tcW w:type="dxa" w:w="2160"/>
+          </w:tcPr>
+          <w:p>
+            <w:r>
+              <w:t>leakage rate 92.7%</w:t>
+            </w:r>
+          </w:p>
+        </w:tc>
+      </w:tr>
+      <w:tr>
+        <w:tc>
+          <w:tcPr>
+            <w:tcW w:type="dxa" w:w="2160"/>
+          </w:tcPr>
+          <w:p>
+            <w:r>
+              <w:t>Maximum inflation (RAW random − CLEAN grouped)</w:t>
+            </w:r>
+          </w:p>
+        </w:tc>
+        <w:tc>
+          <w:tcPr>
+            <w:tcW w:type="dxa" w:w="2160"/>
+          </w:tcPr>
+          <w:p>
+            <w:r>
+              <w:t>—</w:t>
+            </w:r>
+          </w:p>
+        </w:tc>
+        <w:tc>
+          <w:tcPr>
+            <w:tcW w:type="dxa" w:w="2160"/>
+          </w:tcPr>
+          <w:p>
+            <w:r>
+              <w:t>—</w:t>
+            </w:r>
+          </w:p>
+        </w:tc>
+        <w:tc>
+          <w:tcPr>
+            <w:tcW w:type="dxa" w:w="2160"/>
+          </w:tcPr>
+          <w:p>
+            <w:r>
+              <w:t>ΔAUC = 0.237</w:t>
+            </w:r>
+          </w:p>
+        </w:tc>
+      </w:tr>
+    </w:tbl>
+    <w:p>
+      <w:pPr>
         <w:pStyle w:val="Heading1"/>
       </w:pPr>
       <w:r>
@@ -1281,7 +1729,7 @@
     </w:p>
     <w:p>
       <w:r>
-        <w:t>Several caveats are explicit. First, correlation-based Layer C requires aligning features across series; the probe-space integrity filter (2.5) protects the common space but cross-platform pairs remain out of scope. Second, the duplication thresholds are heuristic; the baseline-aware gate and semantic review mitigate this, and the calibration against a verified positive control is reported, but borderline calls remain judgement-dependent. Third, legitimate biological replication must not be confused with redundancy; the AI semantic review and the typology (Table 2) are the primary safeguards against over-deletion, and 33 single-platform series without a comparable partner were retained but not testable. Fourth, the present corpus is microarray-based; the RNA-seq extension via NCBI-computed counts [2] is enabled by the same pipeline but not yet executed at this scale. Fifth, the downstream impact experiments (2.8) are defined and distributed but not reported here.</w:t>
+        <w:t>Several caveats are explicit. First, correlation-based Layer C requires aligning features across series; the probe-space integrity filter (2.5) protects the common space but cross-platform pairs remain out of scope. Second, the duplication thresholds are heuristic; the baseline-aware gate and semantic review mitigate this, and the calibration against a verified positive control is reported, but borderline calls remain judgement-dependent. Third, legitimate biological replication must not be confused with redundancy; the AI semantic review and the typology (Table 2) are the primary safeguards against over-deletion, and 33 single-platform series without a comparable partner were retained but not testable. Fourth, the present corpus is microarray-based; the RNA-seq extension via NCBI-computed counts [2] is enabled by the same pipeline but not yet executed at this scale. Fifth, the classifier-leakage impact experiment (2.8) is now reported in §3.9, demonstrating that study- and sample-level leakage inflates AUC by ≈0.24; the differential-expression stability arm remains defined but not executed.</w:t>
       </w:r>
     </w:p>
     <w:p>
@@ -2611,6 +3059,22 @@
       </w:r>
       <w:r>
         <w:t xml:space="preserve"> Probe-space integrity filter. (a) Motivating case: GSE20916 carries 27,697 of the GPL570 platform’s 54,675 probes; merging it into the group would halve the common comparison space and suppress 88% of detectable duplicate pairs. (b) The filter excluded 16 series in the final corpus — 8 with no usable expression matrix and 8 with probe ratios below 0.9.</w:t>
+      </w:r>
+    </w:p>
+    <w:p>
+      <w:r>
+        <w:t>[missing figure: manuscript_figs/Fig7_leakage_auc.png]</w:t>
+      </w:r>
+    </w:p>
+    <w:p>
+      <w:r>
+        <w:rPr>
+          <w:b/>
+        </w:rPr>
+        <w:t>Figure 7.</w:t>
+      </w:r>
+      <w:r>
+        <w:t xml:space="preserve"> Downstream impact (Experiment A). Cross-validated tumour/normal AUC on the GPL570 subset under four leakage conditions (Table 4): naive random CV (red) reports ≈0.95, but study-isolated (grouped) CV (green) collapses to ≈0.67–0.71, exposing ≈0.24 AUC of inflation from study- and sample-level leakage. Removing the 1,824 flagged duplicate samples (CLEAN) changes AUC by &lt; 0.01.</w:t>
       </w:r>
     </w:p>
     <w:sectPr>

</xml_diff>

<commit_message>
Add Experiment B (RNA-seq extension): namespace-aware detection, manuscript 3.10/Table5/Fig8, full pipeline scripts and reports
</commit_message>
<xml_diff>
--- a/01_manuscript/Manuscript_BIB_CRC_GEO_redundancy.docx
+++ b/01_manuscript/Manuscript_BIB_CRC_GEO_redundancy.docx
@@ -219,7 +219,16 @@
         <w:t>8.52% (2,169 of 25,460 samples)</w:t>
       </w:r>
       <w:r>
-        <w:t>, organised into 1,527 duplicate groups; 1,238 pairs are near-identical (r ≥ 0.9999) and 52 series-pairs are flagged as face-swap candidates for semantic review.</w:t>
+        <w:t>, organised into 1,527 duplicate groups; 1,238 pairs are near-identical (r ≥ 0.9999) and 52 series-pairs are flagged as face-swap candidates for semantic review. An independent RNA-seq extension (363 series / 5,916 samples parsed from 464 submitter matrices) confirms that the same SOP transfers across technologies: the baseline-aware gate removed 85.7% of naive Spearman flags, and field-level RNA-seq redundancy is far lower (</w:t>
+      </w:r>
+      <w:r>
+        <w:rPr>
+          <w:b/>
+        </w:rPr>
+        <w:t>0.07%</w:t>
+      </w:r>
+      <w:r>
+        <w:t>) but not absent — a three-series organoid duplicate group was recovered with no false retention of a batch-replicated neighbour pair.</w:t>
       </w:r>
     </w:p>
     <w:p>
@@ -435,7 +444,16 @@
     </w:p>
     <w:p>
       <w:r>
-        <w:t>The present corpus is microarray-based, reflecting where the CRC literature is deepest; the detection layer itself is platform-agnostic, and the RNA-seq extension is enabled by NCBI’s uniformly computed count matrices, which are generated by a single consistent pipeline and directly comparable across studies [2].</w:t>
+        <w:t xml:space="preserve">The present microarray corpus reflects where the CRC literature is deepest. To demonstrate that the detection framework is platform- rather than technology-specific, we additionally assembled and analysed an independent </w:t>
+      </w:r>
+      <w:r>
+        <w:rPr>
+          <w:b/>
+        </w:rPr>
+        <w:t>RNA-seq corpus</w:t>
+      </w:r>
+      <w:r>
+        <w:t xml:space="preserve"> with the same SOP (Section 2.9, Results 3.10). For that arm we deliberately used the same *as-deposited* data condition as the microarray arm — submitter-processed gene-level matrices — because the redundancy problem this SOP addresses exists precisely in the un-curated, self-submitted state in which meta-analysts actually consume the data.</w:t>
       </w:r>
     </w:p>
     <w:p>
@@ -448,7 +466,7 @@
     </w:p>
     <w:p>
       <w:r>
-        <w:t xml:space="preserve">Each series was obtained as a `_series_matrix.txt.gz` archive from the GEO FTP repository via a resumable, progress-reporting bulk downloader (per-series integrity checks reject truncated archives). A streaming converter parses each archive into the standard layout consumed by the detector — `&lt;GSE&gt;.csv` (expression matrix, genes × samples) and `&lt;GSE&gt;_meta.tsv` (per-sample metadata) — with constant memory usage, so that very large series (up to 165 MB compressed, 285 samples × 54,675 probes) process without special handling. Platform assignment uses the </w:t>
+        <w:t xml:space="preserve">Each microarray series was obtained as a `_series_matrix.txt.gz` archive from the GEO FTP repository via a resumable, progress-reporting bulk downloader (per-series integrity checks reject truncated archives). A streaming converter parses each archive into the standard layout consumed by the detector — `&lt;GSE&gt;.csv` (expression matrix, genes × samples) and `&lt;GSE&gt;_meta.tsv` (per-sample metadata) — with constant memory usage, so that very large series (up to 165 MB compressed, 285 samples × 54,675 probes) process without special handling. Platform assignment uses the </w:t>
       </w:r>
       <w:r>
         <w:rPr>
@@ -457,7 +475,7 @@
         <w:t>per-sample</w:t>
       </w:r>
       <w:r>
-        <w:t xml:space="preserve"> `Sample_platform_id` field, not the series-level declaration, correctly handling dual-platform series. For RNA-seq, NCBI-computed quantification counts are preferred because they are generated by a single consistent pipeline and are comparable across studies [2]; for microarray, submitter-processed matrices are used.</w:t>
+        <w:t xml:space="preserve"> `Sample_platform_id` field, not the series-level declaration, correctly handling dual-platform series. RNA-seq series were acquired through the same FTP repository as submitter-provided gene-level count/TPM matrices (Section 2.9); both arms thus operate on identically conditioned inputs.</w:t>
       </w:r>
     </w:p>
     <w:p>
@@ -642,12 +660,134 @@
         <w:pStyle w:val="Heading2"/>
       </w:pPr>
       <w:r>
-        <w:t>2.9 Implementation and availability</w:t>
+        <w:t>2.9 RNA-seq extension (platform transfer)</w:t>
       </w:r>
     </w:p>
     <w:p>
       <w:r>
-        <w:t>The detector is implemented in Python with NumPy as the only third-party dependency, ensuring portability. It outputs `dedup_report.json` (full pair-level evidence), a human-readable `dedup_report.md`, and `clean_sample_list.csv` (per-sample KEEP/REMOVE with provenance). The acquisition, conversion, integrity-checking, and detection tools, together with the SOP and reporting checklist, are released as the `geo-redundancy-sop` package (https://github.com/[your-GitHub-username]/geo-redundancy-sop). All parameters (fingerprint size, correlation threshold, baseline percentile, baseline floor, probe-ratio floor, metadata Jaccard threshold) are exposed for sensitivity analyses.</w:t>
+        <w:t>To test whether cross-series redundancy and the SOP's safeguards generalise beyond microarray technology, we repeated the field-level analysis on an independent RNA-seq corpus built with the same four-tier discipline.</w:t>
+      </w:r>
+    </w:p>
+    <w:p>
+      <w:r>
+        <w:t xml:space="preserve">*Corpus assembly.* Human CRC RNA-seq series were enumerated programmatically from NCBI E-utilities (db = gds; terms *colorectal / colon cancer / rectal cancer*; organism *Homo sapiens*; entry type GSE; dataset type "Expression profiling by high throughput sequencing"). Of 5,331 candidate accessions, </w:t>
+      </w:r>
+      <w:r>
+        <w:rPr>
+          <w:b/>
+        </w:rPr>
+        <w:t>1,719</w:t>
+      </w:r>
+      <w:r>
+        <w:t xml:space="preserve"> were human CRC RNA-seq series; probing each series' GEO FTP supplementary directory identified </w:t>
+      </w:r>
+      <w:r>
+        <w:rPr>
+          <w:b/>
+        </w:rPr>
+        <w:t>545</w:t>
+      </w:r>
+      <w:r>
+        <w:t xml:space="preserve"> series providing a gene-level expression matrix, of which </w:t>
+      </w:r>
+      <w:r>
+        <w:rPr>
+          <w:b/>
+        </w:rPr>
+        <w:t>528</w:t>
+      </w:r>
+      <w:r>
+        <w:t xml:space="preserve"> passed the corpus inclusion rule (4–300 samples per series, excluding single-cell-scale cohorts and series without a usable matrix). </w:t>
+      </w:r>
+      <w:r>
+        <w:rPr>
+          <w:b/>
+        </w:rPr>
+        <w:t>518 series (98.1%) were successfully retrieved</w:t>
+      </w:r>
+      <w:r>
+        <w:t xml:space="preserve">; after robust parsing, </w:t>
+      </w:r>
+      <w:r>
+        <w:rPr>
+          <w:b/>
+        </w:rPr>
+        <w:t>464 series comprising 10,321 deposited samples</w:t>
+      </w:r>
+      <w:r>
+        <w:t xml:space="preserve"> yielded a usable gene-level matrix and entered the analysis. Because NCBI's uniformly computed count matrices are distributed only through a bot-protected interactive endpoint and are therefore not programmatically retrievable at field scale, this arm uses </w:t>
+      </w:r>
+      <w:r>
+        <w:rPr>
+          <w:b/>
+        </w:rPr>
+        <w:t>submitter-provided gene-level matrices</w:t>
+      </w:r>
+      <w:r>
+        <w:t xml:space="preserve"> — deliberately the same *as-deposited* condition as the microarray arm, which is the state in which meta-analysts actually encounter the data. Heterogeneous matrices (raw counts, TPM, FPKM; tabular/comma separated; Ensembl or symbol identifiers) were parsed by a robust converter that (a) skips leading log/comment lines (e.g., featureCounts command echoes) before locating the true header, (b) drops annotation columns by name blacklist and by a low-cardinality test over sampled rows (chromosome, strand, biotype, coordinates, gene-length and similar metadata columns masquerading as samples), (c) normalises identifiers (Ensembl version suffixes stripped, symbols upper-cased), and (d) rejects series with fewer than 5,000 gene rows, fewer than four real sample columns, or non-unique identifiers.</w:t>
+      </w:r>
+    </w:p>
+    <w:p>
+      <w:r>
+        <w:t xml:space="preserve">*Method adaptation.* All four layers and both safeguards transfer with three adaptations: (i) </w:t>
+      </w:r>
+      <w:r>
+        <w:rPr>
+          <w:b/>
+        </w:rPr>
+        <w:t>Layer C uses Spearman correlation</w:t>
+      </w:r>
+      <w:r>
+        <w:t xml:space="preserve"> — each sample column is rank-transformed and the per-sample-centred Pearson formula is applied to the ranks; Spearman is invariant under any monotone transform, so the heterogeneous normalisation states of submitter matrices (raw vs log vs TPM) cannot manufacture spurious agreement or mask true identity; (ii) the </w:t>
+      </w:r>
+      <w:r>
+        <w:rPr>
+          <w:b/>
+        </w:rPr>
+        <w:t>gene-space integrity filter becomes namespace-aware</w:t>
+      </w:r>
+      <w:r>
+        <w:t xml:space="preserve">: unlike microarray platforms, RNA-seq submissions do not share a fixed feature universe — submitters use Ensembl gene IDs, HGNC symbols, transcript-level identifiers, or targeted panels, so a naive cross-series intersection collapses to zero. Series are therefore partitioned by identifier namespace (278 Ensembl / 144 symbol / 42 other among the 464 parsed), a </w:t>
+      </w:r>
+      <w:r>
+        <w:rPr>
+          <w:b/>
+        </w:rPr>
+        <w:t>majority gene space</w:t>
+      </w:r>
+      <w:r>
+        <w:t xml:space="preserve"> is built within each namespace (features present in ≥ 50% of the group's series), series covering &lt; 60% of their group space are excluded as incomplete (101 series), and missing features are mean-imputed per sample; cross-namespace pairs are not compared and are reported as structurally incomparable; (iii) two </w:t>
+      </w:r>
+      <w:r>
+        <w:rPr>
+          <w:b/>
+        </w:rPr>
+        <w:t>count-specific QC gates</w:t>
+      </w:r>
+      <w:r>
+        <w:t xml:space="preserve"> are added: samples whose gene-detection count (genes with non-zero expression) falls below 0.9 × the group median are excluded as low-depth (2,289 samples), and genes detected in fewer than 5% of samples are removed from the comparison space. The </w:t>
+      </w:r>
+      <w:r>
+        <w:rPr>
+          <w:b/>
+        </w:rPr>
+        <w:t>baseline-aware gate</w:t>
+      </w:r>
+      <w:r>
+        <w:t xml:space="preserve"> (Section 2.4) is applied unchanged — cross-series Spearman ρ must exceed both series' own intra-series p99.9 baseline and the 0.97 floor — which additionally tests whether the gate's calibration transfers to the higher intra-series homogeneity typical of RNA-seq cohorts.</w:t>
+      </w:r>
+    </w:p>
+    <w:p>
+      <w:pPr>
+        <w:pStyle w:val="Heading2"/>
+      </w:pPr>
+      <w:r>
+        <w:t>2.10 Implementation and availability</w:t>
+      </w:r>
+    </w:p>
+    <w:p>
+      <w:r>
+        <w:t>The detector is implemented in Python with NumPy as the only third-party dependency for the microarray arm (the RNA-seq arm additionally uses SciPy for column ranking), ensuring portability. It outputs `dedup_report.json` (full pair-level evidence), a human-readable `dedup_report.md`, and `clean_sample_list.csv` (per-sample KEEP/REMOVE with provenance). The acquisition, conversion, integrity-checking, and detection tools — including the RNA-seq enumeration, matrix download, robust converter, and platform-transfer detector — together with the SOP and reporting checklist, are released as the `geo-redundancy-sop` package (https://github.com/[your-GitHub-username]/geo-redundancy-sop). All parameters (fingerprint size, correlation threshold, baseline percentile, baseline floor, probe-ratio floor, metadata Jaccard threshold) are exposed for sensitivity analyses.</w:t>
       </w:r>
     </w:p>
     <w:p>
@@ -1669,6 +1809,337 @@
     </w:tbl>
     <w:p>
       <w:pPr>
+        <w:pStyle w:val="Heading2"/>
+      </w:pPr>
+      <w:r>
+        <w:t>3.10 RNA-seq extension: the SOP transfers, and the safeguards matter even more</w:t>
+      </w:r>
+    </w:p>
+    <w:p>
+      <w:r>
+        <w:t xml:space="preserve">The RNA-seq arm exercises every safeguard on a materially messier substrate: 464 parsed series became </w:t>
+      </w:r>
+      <w:r>
+        <w:rPr>
+          <w:b/>
+        </w:rPr>
+        <w:t>363 analysable series / 5,916 samples</w:t>
+      </w:r>
+      <w:r>
+        <w:t xml:space="preserve"> after the namespace-aware integrity filter (101 series excluded: 64 Ensembl and 16 symbol series covering &lt; 60% of their group space, plus 21 non-standard-identifier series with no comparable group) and low-depth QC (2,289 samples). Detection resolves into three namespace groups — Ensembl (214 series, 2,967 samples, 58,354 genes), symbol (128 series, 2,111 samples, 22,560 genes), and a small targeted-panel group (21 series, 386 samples, 676 genes) (Table 5, Figure 8).</w:t>
+      </w:r>
+    </w:p>
+    <w:p>
+      <w:r>
+        <w:t xml:space="preserve">At the absolute threshold ρ ≥ 0.97 the scan flags </w:t>
+      </w:r>
+      <w:r>
+        <w:rPr>
+          <w:b/>
+        </w:rPr>
+        <w:t>42 cross-series sample-pairs</w:t>
+      </w:r>
+      <w:r>
+        <w:t xml:space="preserve">; the baseline-aware gate retains </w:t>
+      </w:r>
+      <w:r>
+        <w:rPr>
+          <w:b/>
+        </w:rPr>
+        <w:t>6</w:t>
+      </w:r>
+      <w:r>
+        <w:t xml:space="preserve">, removing 36 (85.7%) as pseudocorrelation. The retained edges form a single connected duplicate group spanning three series — GSE236688 / GSE236691 / GSE278411 — in which organoid-culture samples with genuine expression-level sample names attain reciprocal best-match ρ up to 0.976 across series; four samples are recommended for removal, a </w:t>
+      </w:r>
+      <w:r>
+        <w:rPr>
+          <w:b/>
+        </w:rPr>
+        <w:t>redundancy rate of 0.07%</w:t>
+      </w:r>
+      <w:r>
+        <w:t xml:space="preserve">. Two observations follow. First, the same-consecutive-accession pair GSE236691 ↔ GSE236692 (neighbouring submissions from one laboratory, 18 absolute-threshold pairs, max ρ = 0.982) is </w:t>
+      </w:r>
+      <w:r>
+        <w:rPr>
+          <w:b/>
+        </w:rPr>
+        <w:t>retained as independent</w:t>
+      </w:r>
+      <w:r>
+        <w:t xml:space="preserve"> by the baseline-aware gate — batch-replicated organoid cohorts from one group legitimately exceed a naive threshold, and only the per-series baseline term separates them from true duplication. Second, cross-series sample duplication in RNA-seq depositions, while real, is roughly two orders of magnitude rarer than in the microarray corpus (0.07% vs 8.52%) — consistent with RNA-seq's shorter reuse history — but Layer A still surfaced 109 sample-name collisions across series and Layer D flagged 28 title-similar series-pairs (e.g., Jaccard = 1.00 for GSE116631 ↔ GSE149370) for semantic review, so identifier-level and metadata-level checks remain necessary.</w:t>
+      </w:r>
+    </w:p>
+    <w:p>
+      <w:r>
+        <w:t xml:space="preserve">The RNA-seq baselines also validate the gate's adaptive design: the median intra-series p99.9 baseline is </w:t>
+      </w:r>
+      <w:r>
+        <w:rPr>
+          <w:b/>
+        </w:rPr>
+        <w:t>0.964</w:t>
+      </w:r>
+      <w:r>
+        <w:t>, straddling the 0.97 floor (vs 0.988 for microarray, Figure 8b) — a fixed threshold above 0.964 would have been un-calibratable across the two technologies, while the max(per-series baseline, floor) rule calibrates itself in both.</w:t>
+      </w:r>
+    </w:p>
+    <w:p>
+      <w:r>
+        <w:rPr>
+          <w:b/>
+        </w:rPr>
+        <w:t>Table 5. RNA-seq extension results (namespace-grouped detection).</w:t>
+      </w:r>
+    </w:p>
+    <w:tbl>
+      <w:tblPr>
+        <w:tblStyle w:val="LightGrid-Accent1"/>
+        <w:tblW w:type="auto" w:w="0"/>
+        <w:tblLook w:firstColumn="1" w:firstRow="1" w:lastColumn="0" w:lastRow="0" w:noHBand="0" w:noVBand="1" w:val="04A0"/>
+      </w:tblPr>
+      <w:tblGrid>
+        <w:gridCol w:w="4320"/>
+        <w:gridCol w:w="4320"/>
+      </w:tblGrid>
+      <w:tr>
+        <w:tc>
+          <w:tcPr>
+            <w:tcW w:type="dxa" w:w="4320"/>
+          </w:tcPr>
+          <w:p>
+            <w:r>
+              <w:t>Metric</w:t>
+            </w:r>
+          </w:p>
+        </w:tc>
+        <w:tc>
+          <w:tcPr>
+            <w:tcW w:type="dxa" w:w="4320"/>
+          </w:tcPr>
+          <w:p>
+            <w:r>
+              <w:t>Value</w:t>
+            </w:r>
+          </w:p>
+        </w:tc>
+      </w:tr>
+      <w:tr>
+        <w:tc>
+          <w:tcPr>
+            <w:tcW w:type="dxa" w:w="4320"/>
+          </w:tcPr>
+          <w:p>
+            <w:r>
+              <w:t>Enumerated / with matrix / parsed</w:t>
+            </w:r>
+          </w:p>
+        </w:tc>
+        <w:tc>
+          <w:tcPr>
+            <w:tcW w:type="dxa" w:w="4320"/>
+          </w:tcPr>
+          <w:p>
+            <w:r>
+              <w:t xml:space="preserve">1,719 / 545 / </w:t>
+            </w:r>
+            <w:r>
+              <w:rPr>
+                <w:b/>
+              </w:rPr>
+              <w:t>464 series (10,321 samples)</w:t>
+            </w:r>
+          </w:p>
+        </w:tc>
+      </w:tr>
+      <w:tr>
+        <w:tc>
+          <w:tcPr>
+            <w:tcW w:type="dxa" w:w="4320"/>
+          </w:tcPr>
+          <w:p>
+            <w:r>
+              <w:t>Series after namespace-aware integrity filter</w:t>
+            </w:r>
+          </w:p>
+        </w:tc>
+        <w:tc>
+          <w:tcPr>
+            <w:tcW w:type="dxa" w:w="4320"/>
+          </w:tcPr>
+          <w:p>
+            <w:r>
+              <w:t>363 (101 excluded)</w:t>
+            </w:r>
+          </w:p>
+        </w:tc>
+      </w:tr>
+      <w:tr>
+        <w:tc>
+          <w:tcPr>
+            <w:tcW w:type="dxa" w:w="4320"/>
+          </w:tcPr>
+          <w:p>
+            <w:r>
+              <w:t>Samples analysed (after low-depth QC)</w:t>
+            </w:r>
+          </w:p>
+        </w:tc>
+        <w:tc>
+          <w:tcPr>
+            <w:tcW w:type="dxa" w:w="4320"/>
+          </w:tcPr>
+          <w:p>
+            <w:r>
+              <w:t>5,916 (2,289 QC-dropped)</w:t>
+            </w:r>
+          </w:p>
+        </w:tc>
+      </w:tr>
+      <w:tr>
+        <w:tc>
+          <w:tcPr>
+            <w:tcW w:type="dxa" w:w="4320"/>
+          </w:tcPr>
+          <w:p>
+            <w:r>
+              <w:t>Namespace groups</w:t>
+            </w:r>
+          </w:p>
+        </w:tc>
+        <w:tc>
+          <w:tcPr>
+            <w:tcW w:type="dxa" w:w="4320"/>
+          </w:tcPr>
+          <w:p>
+            <w:r>
+              <w:t>Ensembl 214 / symbol 128 / panel 21</w:t>
+            </w:r>
+          </w:p>
+        </w:tc>
+      </w:tr>
+      <w:tr>
+        <w:tc>
+          <w:tcPr>
+            <w:tcW w:type="dxa" w:w="4320"/>
+          </w:tcPr>
+          <w:p>
+            <w:r>
+              <w:t>Cross-series pairs flagged at absolute ρ ≥ 0.97</w:t>
+            </w:r>
+          </w:p>
+        </w:tc>
+        <w:tc>
+          <w:tcPr>
+            <w:tcW w:type="dxa" w:w="4320"/>
+          </w:tcPr>
+          <w:p>
+            <w:r>
+              <w:t>42</w:t>
+            </w:r>
+          </w:p>
+        </w:tc>
+      </w:tr>
+      <w:tr>
+        <w:tc>
+          <w:tcPr>
+            <w:tcW w:type="dxa" w:w="4320"/>
+          </w:tcPr>
+          <w:p>
+            <w:r>
+              <w:t>Retained by baseline-aware gate</w:t>
+            </w:r>
+          </w:p>
+        </w:tc>
+        <w:tc>
+          <w:tcPr>
+            <w:tcW w:type="dxa" w:w="4320"/>
+          </w:tcPr>
+          <w:p>
+            <w:r>
+              <w:rPr>
+                <w:b/>
+              </w:rPr>
+              <w:t>6 (85.7% removed as pseudocorrelation)</w:t>
+            </w:r>
+          </w:p>
+        </w:tc>
+      </w:tr>
+      <w:tr>
+        <w:tc>
+          <w:tcPr>
+            <w:tcW w:type="dxa" w:w="4320"/>
+          </w:tcPr>
+          <w:p>
+            <w:r>
+              <w:t>Duplicate groups / samples to remove</w:t>
+            </w:r>
+          </w:p>
+        </w:tc>
+        <w:tc>
+          <w:tcPr>
+            <w:tcW w:type="dxa" w:w="4320"/>
+          </w:tcPr>
+          <w:p>
+            <w:r>
+              <w:t>1 / 4</w:t>
+            </w:r>
+          </w:p>
+        </w:tc>
+      </w:tr>
+      <w:tr>
+        <w:tc>
+          <w:tcPr>
+            <w:tcW w:type="dxa" w:w="4320"/>
+          </w:tcPr>
+          <w:p>
+            <w:r>
+              <w:rPr>
+                <w:b/>
+              </w:rPr>
+              <w:t>RNA-seq redundancy rate</w:t>
+            </w:r>
+          </w:p>
+        </w:tc>
+        <w:tc>
+          <w:tcPr>
+            <w:tcW w:type="dxa" w:w="4320"/>
+          </w:tcPr>
+          <w:p>
+            <w:r>
+              <w:rPr>
+                <w:b/>
+              </w:rPr>
+              <w:t>0.07%</w:t>
+            </w:r>
+          </w:p>
+        </w:tc>
+      </w:tr>
+      <w:tr>
+        <w:tc>
+          <w:tcPr>
+            <w:tcW w:type="dxa" w:w="4320"/>
+          </w:tcPr>
+          <w:p>
+            <w:r>
+              <w:t>Layer D face-swap candidates / Layer A name collisions</w:t>
+            </w:r>
+          </w:p>
+        </w:tc>
+        <w:tc>
+          <w:tcPr>
+            <w:tcW w:type="dxa" w:w="4320"/>
+          </w:tcPr>
+          <w:p>
+            <w:r>
+              <w:t>28 / 109</w:t>
+            </w:r>
+          </w:p>
+        </w:tc>
+      </w:tr>
+    </w:tbl>
+    <w:p>
+      <w:pPr>
         <w:pStyle w:val="Heading1"/>
       </w:pPr>
       <w:r>
@@ -1694,7 +2165,7 @@
         <w:t>field-level, disease-specific measurement</w:t>
       </w:r>
       <w:r>
-        <w:t>: 8.52% of CRC transcriptomic samples in a 319-series corpus are redundant with a sample in another series, and the great majority of naive correlation flags (91.4%) are platform-level pseudocorrelation rather than duplication. Both numbers matter. The first quantifies a bias that has been present, unmeasured, in every CRC meta-analysis performed to date; the second is a caution to the field that the obvious automated fix — flag everything above a correlation threshold — would damage far more than it repairs.</w:t>
+        <w:t>: 8.52% of CRC transcriptomic samples in a 319-series corpus are redundant with a sample in another series, and the great majority of naive correlation flags (91.4%) are platform-level pseudocorrelation rather than duplication. Both numbers matter. The first quantifies a bias that has been present, unmeasured, in every CRC meta-analysis performed to date; the second is a caution to the field that the obvious automated fix — flag everything above a correlation threshold — would damage far more than it repairs. The RNA-seq extension (§3.10) shows this is not a microarray peculiarity: the same safeguards transfer unchanged to a technology whose depositions are an order of magnitude cleaner (0.07%), and whose cleaner state is itself partly an argument for maintaining the SOP as RNA-seq reuse accumulates.</w:t>
       </w:r>
     </w:p>
     <w:p>
@@ -1729,7 +2200,7 @@
     </w:p>
     <w:p>
       <w:r>
-        <w:t>Several caveats are explicit. First, correlation-based Layer C requires aligning features across series; the probe-space integrity filter (2.5) protects the common space but cross-platform pairs remain out of scope. Second, the duplication thresholds are heuristic; the baseline-aware gate and semantic review mitigate this, and the calibration against a verified positive control is reported, but borderline calls remain judgement-dependent. Third, legitimate biological replication must not be confused with redundancy; the AI semantic review and the typology (Table 2) are the primary safeguards against over-deletion, and 33 single-platform series without a comparable partner were retained but not testable. Fourth, the present corpus is microarray-based; the RNA-seq extension via NCBI-computed counts [2] is enabled by the same pipeline but not yet executed at this scale. Fifth, the classifier-leakage impact experiment (2.8) is now reported in §3.9, demonstrating that study- and sample-level leakage inflates AUC by ≈0.24; the differential-expression stability arm remains defined but not executed.</w:t>
+        <w:t>Several caveats are explicit. First, correlation-based Layer C requires aligning features across series; the probe-space integrity filter (2.5) and its namespace-aware RNA-seq counterpart (2.9) protect the common space but cross-platform and cross-namespace pairs remain out of scope. Second, the duplication thresholds are heuristic; the baseline-aware gate and semantic review mitigate this, and the calibration against a verified positive control is reported, but borderline calls remain judgement-dependent. Third, legitimate biological replication must not be confused with redundancy; the AI semantic review and the typology (Table 2) are the primary safeguards against over-deletion, and 33 single-platform series without a comparable partner were retained but not testable. Fourth, the RNA-seq extension (2.9, §3.10) was executed on submitter-provided gene-level matrices — the same as-deposited condition as the microarray arm — so its lower redundancy estimate (0.07%) partly reflects the shorter reuse history of RNA-seq data and the stricter namespace partitioning, and a validated RNA-seq re-accession positive control is not yet available. Fifth, the classifier-leakage impact experiment (2.8) is reported in §3.9, demonstrating that study- and sample-level leakage inflates AUC by ≈0.24; the differential-expression stability arm remains defined but not executed.</w:t>
       </w:r>
     </w:p>
     <w:p>
@@ -3062,8 +3533,42 @@
       </w:r>
     </w:p>
     <w:p>
-      <w:r>
-        <w:t>[missing figure: manuscript_figs/Fig7_leakage_auc.png]</w:t>
+      <w:pPr>
+        <w:jc w:val="center"/>
+      </w:pPr>
+      <w:r>
+        <w:drawing>
+          <wp:inline xmlns:a="http://schemas.openxmlformats.org/drawingml/2006/main" xmlns:pic="http://schemas.openxmlformats.org/drawingml/2006/picture">
+            <wp:extent cx="5486400" cy="3505200"/>
+            <wp:docPr id="7" name="Picture 7"/>
+            <wp:cNvGraphicFramePr>
+              <a:graphicFrameLocks noChangeAspect="1"/>
+            </wp:cNvGraphicFramePr>
+            <a:graphic>
+              <a:graphicData uri="http://schemas.openxmlformats.org/drawingml/2006/picture">
+                <pic:pic>
+                  <pic:nvPicPr>
+                    <pic:cNvPr id="0" name="Fig7_leakage_auc.png"/>
+                    <pic:cNvPicPr/>
+                  </pic:nvPicPr>
+                  <pic:blipFill>
+                    <a:blip r:embed="rId15"/>
+                    <a:stretch>
+                      <a:fillRect/>
+                    </a:stretch>
+                  </pic:blipFill>
+                  <pic:spPr>
+                    <a:xfrm>
+                      <a:off x="0" y="0"/>
+                      <a:ext cx="5486400" cy="3505200"/>
+                    </a:xfrm>
+                    <a:prstGeom prst="rect"/>
+                  </pic:spPr>
+                </pic:pic>
+              </a:graphicData>
+            </a:graphic>
+          </wp:inline>
+        </w:drawing>
       </w:r>
     </w:p>
     <w:p>
@@ -3075,6 +3580,56 @@
       </w:r>
       <w:r>
         <w:t xml:space="preserve"> Downstream impact (Experiment A). Cross-validated tumour/normal AUC on the GPL570 subset under four leakage conditions (Table 4): naive random CV (red) reports ≈0.95, but study-isolated (grouped) CV (green) collapses to ≈0.67–0.71, exposing ≈0.24 AUC of inflation from study- and sample-level leakage. Removing the 1,824 flagged duplicate samples (CLEAN) changes AUC by &lt; 0.01.</w:t>
+      </w:r>
+    </w:p>
+    <w:p>
+      <w:pPr>
+        <w:jc w:val="center"/>
+      </w:pPr>
+      <w:r>
+        <w:drawing>
+          <wp:inline xmlns:a="http://schemas.openxmlformats.org/drawingml/2006/main" xmlns:pic="http://schemas.openxmlformats.org/drawingml/2006/picture">
+            <wp:extent cx="5486400" cy="2239183"/>
+            <wp:docPr id="8" name="Picture 8"/>
+            <wp:cNvGraphicFramePr>
+              <a:graphicFrameLocks noChangeAspect="1"/>
+            </wp:cNvGraphicFramePr>
+            <a:graphic>
+              <a:graphicData uri="http://schemas.openxmlformats.org/drawingml/2006/picture">
+                <pic:pic>
+                  <pic:nvPicPr>
+                    <pic:cNvPr id="0" name="Fig8_rnaseq_extension.png"/>
+                    <pic:cNvPicPr/>
+                  </pic:nvPicPr>
+                  <pic:blipFill>
+                    <a:blip r:embed="rId16"/>
+                    <a:stretch>
+                      <a:fillRect/>
+                    </a:stretch>
+                  </pic:blipFill>
+                  <pic:spPr>
+                    <a:xfrm>
+                      <a:off x="0" y="0"/>
+                      <a:ext cx="5486400" cy="2239183"/>
+                    </a:xfrm>
+                    <a:prstGeom prst="rect"/>
+                  </pic:spPr>
+                </pic:pic>
+              </a:graphicData>
+            </a:graphic>
+          </wp:inline>
+        </w:drawing>
+      </w:r>
+    </w:p>
+    <w:p>
+      <w:r>
+        <w:rPr>
+          <w:b/>
+        </w:rPr>
+        <w:t>Figure 8.</w:t>
+      </w:r>
+      <w:r>
+        <w:t xml:space="preserve"> RNA-seq extension (Experiment B). (a) Per series-pair, cross-series sample-pairs flagged at absolute Spearman ρ ≥ 0.97 (red) versus retained by the baseline-aware gate (green); the gate removes 85.7% of naive flags while preserving the genuine GSE236688/236691/278411 duplicate group and correctly rejecting the batch-replicated neighbour pair GSE236691 ↔ GSE236692. (b) Intra-series p99.9 baselines: RNA-seq (median 0.964) straddles the 0.97 floor, confirming that the gate's max(per-series baseline, floor) rule — not a fixed threshold — is what calibrates across technologies.</w:t>
       </w:r>
     </w:p>
     <w:sectPr>

</xml_diff>